<commit_message>
feat(ui): add elapsed-time clock showing time since arrest
Adds a live-updating clock section to the homepage displaying elapsed
time since Benjamin Allen's arrest on October 19, 2019. The component
renders years, months, days, hours, minutes, and seconds with real-time
JavaScript updates.
</commit_message>
<xml_diff>
--- a/documents/No Remedial Action After Alleged ADA Witness Coaching.docx
+++ b/documents/No Remedial Action After Alleged ADA Witness Coaching.docx
@@ -2182,7 +2182,43 @@
         <w:rPr>
           <w:rFonts w:ascii="Century Schoolbook" w:hAnsi="Century Schoolbook"/>
         </w:rPr>
-        <w:t xml:space="preserve"> evidence. Each overruling removed a potential barrier to the State's narrative. Each ruling was framed in terms of discretion — "illustrative purposes," "sufficiently reliable" — but the cumulative effect was to lower the State's evidentiary burden at precisely the points where the record was weakest. The court did not merely err in individual rulings; it created a procedural environment in which the State could present a manufactured case with minimal judicial scrutiny.</w:t>
+        <w:t xml:space="preserve"> evidence. Each overruling removed a potential barrier to the </w:t>
+      </w:r>
+      <w:r>
+        <w:rPr>
+          <w:rFonts w:ascii="Century Schoolbook" w:hAnsi="Century Schoolbook"/>
+        </w:rPr>
+        <w:t>State’s</w:t>
+      </w:r>
+      <w:r>
+        <w:rPr>
+          <w:rFonts w:ascii="Century Schoolbook" w:hAnsi="Century Schoolbook"/>
+        </w:rPr>
+        <w:t xml:space="preserve"> narrative. Each ruling was framed in terms of discretion — "illustrative purposes,</w:t>
+      </w:r>
+      <w:r>
+        <w:rPr>
+          <w:rFonts w:ascii="Century Schoolbook" w:hAnsi="Century Schoolbook"/>
+        </w:rPr>
+        <w:t>”</w:t>
+      </w:r>
+      <w:r>
+        <w:rPr>
+          <w:rFonts w:ascii="Century Schoolbook" w:hAnsi="Century Schoolbook"/>
+        </w:rPr>
+        <w:t xml:space="preserve"> "sufficiently reliable" — but the cumulative effect was to lower the </w:t>
+      </w:r>
+      <w:r>
+        <w:rPr>
+          <w:rFonts w:ascii="Century Schoolbook" w:hAnsi="Century Schoolbook"/>
+        </w:rPr>
+        <w:t>State’s</w:t>
+      </w:r>
+      <w:r>
+        <w:rPr>
+          <w:rFonts w:ascii="Century Schoolbook" w:hAnsi="Century Schoolbook"/>
+        </w:rPr>
+        <w:t xml:space="preserve"> evidentiary burden at precisely the points where the record was weakest. The court did not merely err in individual rulings; it created a procedural environment in which the State could present a manufactured case with minimal judicial scrutiny.</w:t>
       </w:r>
     </w:p>
     <w:p>

</xml_diff>